<commit_message>
Full rebuild Vayailech 5786
</commit_message>
<xml_diff>
--- a/Files/05 - Devarim/09 - Vayailech/5786/Vayailech 5786.docx
+++ b/Files/05 - Devarim/09 - Vayailech/5786/Vayailech 5786.docx
@@ -739,7 +739,7 @@
           <w:rFonts w:ascii="Times New Roman" w:hAnsi="Times New Roman" w:cs="Times New Roman"/>
           <w:rtl/>
         </w:rPr>
-        <w:t>"</w:t>
+        <w:t>״</w:t>
       </w:r>
       <w:r>
         <w:rPr>
@@ -792,7 +792,7 @@
           <w:rFonts w:ascii="Times New Roman" w:hAnsi="Times New Roman" w:cs="Times New Roman"/>
           <w:rtl/>
         </w:rPr>
-        <w:t>"</w:t>
+        <w:t>״</w:t>
       </w:r>
       <w:r>
         <w:rPr>
@@ -1157,7 +1157,7 @@
           <w:rFonts w:ascii="Times New Roman" w:hAnsi="Times New Roman" w:cs="Times New Roman"/>
           <w:rtl/>
         </w:rPr>
-        <w:t>"</w:t>
+        <w:t>״</w:t>
       </w:r>
       <w:r>
         <w:rPr>
@@ -1689,7 +1689,7 @@
           <w:rFonts w:ascii="Times New Roman" w:hAnsi="Times New Roman" w:cs="Times New Roman"/>
           <w:rtl/>
         </w:rPr>
-        <w:t>"</w:t>
+        <w:t>״</w:t>
       </w:r>
       <w:r>
         <w:rPr>
@@ -2632,7 +2632,7 @@
           <w:rFonts w:ascii="Times New Roman" w:hAnsi="Times New Roman" w:cs="Times New Roman"/>
           <w:rtl/>
         </w:rPr>
-        <w:t>"</w:t>
+        <w:t>״</w:t>
       </w:r>
       <w:r>
         <w:rPr>
@@ -2699,7 +2699,7 @@
           <w:rFonts w:ascii="Times New Roman" w:hAnsi="Times New Roman" w:cs="Times New Roman"/>
           <w:rtl/>
         </w:rPr>
-        <w:t>"</w:t>
+        <w:t>״</w:t>
       </w:r>
       <w:r>
         <w:rPr>
@@ -2726,7 +2726,7 @@
           <w:rFonts w:ascii="Times New Roman" w:hAnsi="Times New Roman" w:cs="Times New Roman"/>
           <w:rtl/>
         </w:rPr>
-        <w:t>"</w:t>
+        <w:t>״</w:t>
       </w:r>
       <w:r>
         <w:rPr>
@@ -3195,7 +3195,7 @@
           <w:rFonts w:ascii="Times New Roman" w:hAnsi="Times New Roman" w:cs="Times New Roman"/>
           <w:rtl/>
         </w:rPr>
-        <w:t>"</w:t>
+        <w:t>״</w:t>
       </w:r>
       <w:r>
         <w:rPr>
@@ -3300,7 +3300,7 @@
           <w:rFonts w:ascii="Times New Roman" w:hAnsi="Times New Roman" w:cs="Times New Roman"/>
           <w:rtl/>
         </w:rPr>
-        <w:t>"</w:t>
+        <w:t>״</w:t>
       </w:r>
       <w:r>
         <w:rPr>
@@ -3442,7 +3442,7 @@
         <w:rPr>
           <w:rFonts w:ascii="Times New Roman" w:hAnsi="Times New Roman" w:cs="Times New Roman"/>
         </w:rPr>
-        <w:t xml:space="preserve"> of</w:t>
+        <w:t xml:space="preserve"> of </w:t>
       </w:r>
       <w:r>
         <w:rPr>

</xml_diff>